<commit_message>
Sprint 2 rev, fine giornata
</commit_message>
<xml_diff>
--- a/4_Diari/2025.03.26.docx
+++ b/4_Diari/2025.03.26.docx
@@ -329,6 +329,24 @@
           </w:p>
           <w:p>
             <w:pPr>
+              <w:pStyle w:val="Paragrafoelenco"/>
+              <w:numPr>
+                <w:ilvl w:val="1"/>
+                <w:numId w:val="21"/>
+              </w:numPr>
+              <w:rPr>
+                <w:rFonts w:ascii="Arial" w:hAnsi="Arial" w:cs="Arial"/>
+              </w:rPr>
+            </w:pPr>
+            <w:r>
+              <w:rPr>
+                <w:rFonts w:ascii="Arial" w:hAnsi="Arial" w:cs="Arial"/>
+              </w:rPr>
+              <w:t>Finito sprint 2</w:t>
+            </w:r>
+          </w:p>
+          <w:p>
+            <w:pPr>
               <w:rPr>
                 <w:rFonts w:ascii="Arial" w:hAnsi="Arial" w:cs="Arial"/>
               </w:rPr>
@@ -544,8 +562,53 @@
               <w:rPr>
                 <w:rFonts w:ascii="Arial" w:hAnsi="Arial" w:cs="Arial"/>
                 <w:u w:val="single"/>
+                <w:lang w:val="fr-CH"/>
               </w:rPr>
             </w:pPr>
+            <w:r>
+              <w:rPr>
+                <w:rFonts w:ascii="Arial" w:hAnsi="Arial" w:cs="Arial"/>
+                <w:u w:val="single"/>
+                <w:lang w:val="fr-CH"/>
+              </w:rPr>
+              <w:t xml:space="preserve">Sprint </w:t>
+            </w:r>
+            <w:proofErr w:type="spellStart"/>
+            <w:r>
+              <w:rPr>
+                <w:rFonts w:ascii="Arial" w:hAnsi="Arial" w:cs="Arial"/>
+                <w:u w:val="single"/>
+                <w:lang w:val="fr-CH"/>
+              </w:rPr>
+              <w:t>Retrospective</w:t>
+            </w:r>
+            <w:proofErr w:type="spellEnd"/>
+            <w:r>
+              <w:rPr>
+                <w:rFonts w:ascii="Arial" w:hAnsi="Arial" w:cs="Arial"/>
+                <w:u w:val="single"/>
+                <w:lang w:val="fr-CH"/>
+              </w:rPr>
+              <w:t xml:space="preserve">, </w:t>
+            </w:r>
+            <w:proofErr w:type="spellStart"/>
+            <w:r>
+              <w:rPr>
+                <w:rFonts w:ascii="Arial" w:hAnsi="Arial" w:cs="Arial"/>
+                <w:u w:val="single"/>
+                <w:lang w:val="fr-CH"/>
+              </w:rPr>
+              <w:t>daily</w:t>
+            </w:r>
+            <w:proofErr w:type="spellEnd"/>
+            <w:r>
+              <w:rPr>
+                <w:rFonts w:ascii="Arial" w:hAnsi="Arial" w:cs="Arial"/>
+                <w:u w:val="single"/>
+                <w:lang w:val="fr-CH"/>
+              </w:rPr>
+              <w:t xml:space="preserve"> sprint e Sprint planning</w:t>
+            </w:r>
           </w:p>
         </w:tc>
       </w:tr>
@@ -554,6 +617,7 @@
       <w:pPr>
         <w:rPr>
           <w:rFonts w:ascii="Arial" w:hAnsi="Arial" w:cs="Arial"/>
+          <w:lang w:val="fr-CH"/>
         </w:rPr>
       </w:pPr>
     </w:p>
@@ -672,6 +736,42 @@
           </w:p>
           <w:p>
             <w:pPr>
+              <w:pStyle w:val="Paragrafoelenco"/>
+              <w:numPr>
+                <w:ilvl w:val="0"/>
+                <w:numId w:val="26"/>
+              </w:numPr>
+              <w:rPr>
+                <w:rFonts w:ascii="Arial" w:hAnsi="Arial" w:cs="Arial"/>
+              </w:rPr>
+            </w:pPr>
+            <w:r>
+              <w:rPr>
+                <w:rFonts w:ascii="Arial" w:hAnsi="Arial" w:cs="Arial"/>
+              </w:rPr>
+              <w:t>Profilo utente</w:t>
+            </w:r>
+          </w:p>
+          <w:p>
+            <w:pPr>
+              <w:pStyle w:val="Paragrafoelenco"/>
+              <w:numPr>
+                <w:ilvl w:val="0"/>
+                <w:numId w:val="26"/>
+              </w:numPr>
+              <w:rPr>
+                <w:rFonts w:ascii="Arial" w:hAnsi="Arial" w:cs="Arial"/>
+              </w:rPr>
+            </w:pPr>
+            <w:r>
+              <w:rPr>
+                <w:rFonts w:ascii="Arial" w:hAnsi="Arial" w:cs="Arial"/>
+              </w:rPr>
+              <w:t>Aggiornamento varie funzionalità</w:t>
+            </w:r>
+          </w:p>
+          <w:p>
+            <w:pPr>
               <w:rPr>
                 <w:rFonts w:ascii="Arial" w:hAnsi="Arial" w:cs="Arial"/>
               </w:rPr>
@@ -718,8 +818,42 @@
               </w:rPr>
               <w:t xml:space="preserve">Ricerca nota </w:t>
             </w:r>
-            <w:bookmarkStart w:id="3" w:name="_GoBack"/>
-            <w:bookmarkEnd w:id="3"/>
+          </w:p>
+          <w:p>
+            <w:pPr>
+              <w:pStyle w:val="Paragrafoelenco"/>
+              <w:numPr>
+                <w:ilvl w:val="0"/>
+                <w:numId w:val="26"/>
+              </w:numPr>
+              <w:rPr>
+                <w:rFonts w:ascii="Arial" w:hAnsi="Arial" w:cs="Arial"/>
+              </w:rPr>
+            </w:pPr>
+            <w:r>
+              <w:rPr>
+                <w:rFonts w:ascii="Arial" w:hAnsi="Arial" w:cs="Arial"/>
+              </w:rPr>
+              <w:t>Test case</w:t>
+            </w:r>
+          </w:p>
+          <w:p>
+            <w:pPr>
+              <w:pStyle w:val="Paragrafoelenco"/>
+              <w:numPr>
+                <w:ilvl w:val="0"/>
+                <w:numId w:val="26"/>
+              </w:numPr>
+              <w:rPr>
+                <w:rFonts w:ascii="Arial" w:hAnsi="Arial" w:cs="Arial"/>
+              </w:rPr>
+            </w:pPr>
+            <w:r>
+              <w:rPr>
+                <w:rFonts w:ascii="Arial" w:hAnsi="Arial" w:cs="Arial"/>
+              </w:rPr>
+              <w:t>Doc. task</w:t>
+            </w:r>
           </w:p>
           <w:p>
             <w:pPr>
@@ -783,6 +917,7 @@
               <w:rPr>
                 <w:rFonts w:ascii="Arial" w:hAnsi="Arial" w:cs="Arial"/>
               </w:rPr>
+              <w:lastRenderedPageBreak/>
               <w:t xml:space="preserve">Obbiettivi: </w:t>
             </w:r>
             <w:r>
@@ -842,7 +977,6 @@
               <w:rPr>
                 <w:noProof/>
               </w:rPr>
-              <w:lastRenderedPageBreak/>
               <w:drawing>
                 <wp:inline distT="0" distB="0" distL="0" distR="0" wp14:anchorId="321571C6" wp14:editId="1B62E7FD">
                   <wp:extent cx="1105134" cy="2620917"/>
@@ -978,6 +1112,14 @@
                 <w:rFonts w:ascii="Arial" w:hAnsi="Arial" w:cs="Arial"/>
               </w:rPr>
             </w:pPr>
+            <w:r>
+              <w:rPr>
+                <w:rFonts w:ascii="Arial" w:hAnsi="Arial" w:cs="Arial"/>
+              </w:rPr>
+              <w:t>Discusso dalle 15:00 alle 15:25, Lavoro svolto bene con ordine e mantenuto obbiettivo principale, la comunicazione.</w:t>
+            </w:r>
+            <w:bookmarkStart w:id="3" w:name="_GoBack"/>
+            <w:bookmarkEnd w:id="3"/>
           </w:p>
         </w:tc>
       </w:tr>
@@ -5365,6 +5507,7 @@
     <w:rsid w:val="00986F8A"/>
     <w:rsid w:val="00997E7D"/>
     <w:rsid w:val="009D5B0A"/>
+    <w:rsid w:val="009F090E"/>
     <w:rsid w:val="00A0666A"/>
     <w:rsid w:val="00A139A6"/>
     <w:rsid w:val="00A1514F"/>
@@ -6209,7 +6352,7 @@
 </file>
 
 <file path=customXml/itemProps1.xml><?xml version="1.0" encoding="utf-8"?>
-<ds:datastoreItem xmlns:ds="http://schemas.openxmlformats.org/officeDocument/2006/customXml" ds:itemID="{95F5543B-3080-400D-AE05-C530BD6B7403}">
+<ds:datastoreItem xmlns:ds="http://schemas.openxmlformats.org/officeDocument/2006/customXml" ds:itemID="{1C995678-B3B0-4E9E-8072-23266EC4AE5E}">
   <ds:schemaRefs>
     <ds:schemaRef ds:uri="http://schemas.openxmlformats.org/officeDocument/2006/bibliography"/>
   </ds:schemaRefs>

</xml_diff>